<commit_message>
Refactor privacy analysis and communication overhead sections in Chapter 3, enhancing clarity and detail on FedAnchor's advantages. Summarize Chapter 3 with a focus on the innovative framework and its implications for federated learning. Revise Chapter 4's background to emphasize the need for a federated knowledge graph alignment system in maritime law, detailing the architecture and data distribution strategies. Update the network topology to reflect a star federated structure, ensuring data security and compliance. Adjust the document formatting and references for consistency.
</commit_message>
<xml_diff>
--- a/custom-reference.docx
+++ b/custom-reference.docx
@@ -212,8 +212,8 @@
         <w:tblCaption w:val="Table caption."/>
       </w:tblPr>
       <w:tblGrid>
-        <w:gridCol w:w="831"/>
-        <w:gridCol w:w="831"/>
+        <w:gridCol w:w="823"/>
+        <w:gridCol w:w="823"/>
       </w:tblGrid>
       <w:tr>
         <w:trPr>
@@ -848,7 +848,7 @@
     <w:semiHidden/>
     <w:unhideWhenUsed/>
     <w:qFormat/>
-    <w:rsid w:val="00A10FD9"/>
+    <w:rsid w:val="00733AFB"/>
     <w:pPr>
       <w:keepNext/>
       <w:keepLines/>
@@ -856,10 +856,10 @@
       <w:outlineLvl w:val="3"/>
     </w:pPr>
     <w:rPr>
-      <w:rFonts w:eastAsiaTheme="majorEastAsia" w:cstheme="majorBidi"/>
-      <w:i/>
+      <w:rFonts w:eastAsia="宋体" w:cstheme="majorBidi"/>
       <w:iCs/>
-      <w:color w:val="0F4761" w:themeColor="accent1" w:themeShade="BF"/>
+      <w:color w:val="000000" w:themeColor="text1"/>
+      <w:sz w:val="28"/>
     </w:rPr>
   </w:style>
   <w:style w:type="paragraph" w:styleId="5">
@@ -1002,13 +1002,14 @@
     <w:name w:val="Body Text"/>
     <w:basedOn w:val="a"/>
     <w:qFormat/>
-    <w:rsid w:val="006E222E"/>
+    <w:rsid w:val="00A311E2"/>
     <w:pPr>
       <w:spacing w:after="0" w:line="360" w:lineRule="auto"/>
       <w:ind w:firstLineChars="200" w:firstLine="200"/>
-    </w:pPr>
-    <w:rPr>
-      <w:rFonts w:eastAsia="宋体"/>
+      <w:jc w:val="both"/>
+    </w:pPr>
+    <w:rPr>
+      <w:rFonts w:ascii="Times New Roman" w:eastAsia="宋体" w:hAnsi="Times New Roman"/>
     </w:rPr>
   </w:style>
   <w:style w:type="paragraph" w:customStyle="1" w:styleId="FirstParagraph">
@@ -1203,12 +1204,12 @@
     <w:link w:val="4"/>
     <w:uiPriority w:val="9"/>
     <w:semiHidden/>
-    <w:rsid w:val="00A10FD9"/>
-    <w:rPr>
-      <w:rFonts w:eastAsiaTheme="majorEastAsia" w:cstheme="majorBidi"/>
-      <w:i/>
+    <w:rsid w:val="00733AFB"/>
+    <w:rPr>
+      <w:rFonts w:eastAsia="宋体" w:cstheme="majorBidi"/>
       <w:iCs/>
-      <w:color w:val="0F4761" w:themeColor="accent1" w:themeShade="BF"/>
+      <w:color w:val="000000" w:themeColor="text1"/>
+      <w:sz w:val="28"/>
     </w:rPr>
   </w:style>
   <w:style w:type="character" w:customStyle="1" w:styleId="50">

</xml_diff>